<commit_message>
Updates from emendations provided by DEM. Initial code and index for pagefind
</commit_message>
<xml_diff>
--- a/BDL_DonaldMeek/sites.google.com/site/deansbook/BDLtable.docx
+++ b/BDL_DonaldMeek/sites.google.com/site/deansbook/BDLtable.docx
@@ -47,7 +47,7 @@
                 <wp:extent cx="274320" cy="274320"/>
                 <wp:effectExtent l="0" t="0" r="5080" b="5080"/>
                 <wp:wrapNone/>
-                <wp:docPr id="1690118816" name="Rectangle 4"/>
+                <wp:docPr id="1890402867" name="Rectangle 4"/>
                 <wp:cNvGraphicFramePr>
                   <a:graphicFrameLocks xmlns:a="http://schemas.openxmlformats.org/drawingml/2006/main"/>
                 </wp:cNvGraphicFramePr>
@@ -94,7 +94,7 @@
           </mc:Choice>
           <mc:Fallback>
             <w:pict>
-              <v:rect w14:anchorId="49E0F408" id="Rectangle 4" o:spid="_x0000_s1026" style="position:absolute;margin-left:323.55pt;margin-top:28.75pt;width:21.6pt;height:21.6pt;z-index:251657216;visibility:visible;mso-wrap-style:square;mso-width-percent:0;mso-height-percent:0;mso-wrap-distance-left:9pt;mso-wrap-distance-top:0;mso-wrap-distance-right:9pt;mso-wrap-distance-bottom:0;mso-position-horizontal:absolute;mso-position-horizontal-relative:text;mso-position-vertical:absolute;mso-position-vertical-relative:text;mso-width-percent:0;mso-height-percent:0;mso-width-relative:page;mso-height-relative:page;v-text-anchor:top" o:gfxdata="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" o:allowincell="f" fillcolor="#969696">
+              <v:rect w14:anchorId="793DC451" id="Rectangle 4" o:spid="_x0000_s1026" style="position:absolute;margin-left:323.55pt;margin-top:28.75pt;width:21.6pt;height:21.6pt;z-index:251657216;visibility:visible;mso-wrap-style:square;mso-width-percent:0;mso-height-percent:0;mso-wrap-distance-left:9pt;mso-wrap-distance-top:0;mso-wrap-distance-right:9pt;mso-wrap-distance-bottom:0;mso-position-horizontal:absolute;mso-position-horizontal-relative:text;mso-position-vertical:absolute;mso-position-vertical-relative:text;mso-width-percent:0;mso-height-percent:0;mso-width-relative:page;mso-height-relative:page;v-text-anchor:top" o:gfxdata="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" o:allowincell="f" fillcolor="#969696">
                 <v:path arrowok="t"/>
               </v:rect>
             </w:pict>
@@ -120,7 +120,7 @@
                 <wp:extent cx="274320" cy="274320"/>
                 <wp:effectExtent l="0" t="0" r="5080" b="5080"/>
                 <wp:wrapNone/>
-                <wp:docPr id="656993280" name="Rectangle 3"/>
+                <wp:docPr id="1436118440" name="Rectangle 3"/>
                 <wp:cNvGraphicFramePr>
                   <a:graphicFrameLocks xmlns:a="http://schemas.openxmlformats.org/drawingml/2006/main"/>
                 </wp:cNvGraphicFramePr>
@@ -169,7 +169,7 @@
           </mc:Choice>
           <mc:Fallback>
             <w:pict>
-              <v:rect w14:anchorId="335DB1AB" id="Rectangle 3" o:spid="_x0000_s1026" style="position:absolute;margin-left:211.15pt;margin-top:28.75pt;width:21.6pt;height:21.6pt;z-index:251656192;visibility:visible;mso-wrap-style:square;mso-width-percent:0;mso-height-percent:0;mso-wrap-distance-left:9pt;mso-wrap-distance-top:0;mso-wrap-distance-right:9pt;mso-wrap-distance-bottom:0;mso-position-horizontal:absolute;mso-position-horizontal-relative:text;mso-position-vertical:absolute;mso-position-vertical-relative:text;mso-width-percent:0;mso-height-percent:0;mso-width-relative:page;mso-height-relative:page;v-text-anchor:top" o:gfxdata="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" o:allowincell="f">
+              <v:rect w14:anchorId="34BFA4FC" id="Rectangle 3" o:spid="_x0000_s1026" style="position:absolute;margin-left:211.15pt;margin-top:28.75pt;width:21.6pt;height:21.6pt;z-index:251656192;visibility:visible;mso-wrap-style:square;mso-width-percent:0;mso-height-percent:0;mso-wrap-distance-left:9pt;mso-wrap-distance-top:0;mso-wrap-distance-right:9pt;mso-wrap-distance-bottom:0;mso-position-horizontal:absolute;mso-position-horizontal-relative:text;mso-position-vertical:absolute;mso-position-vertical-relative:text;mso-width-percent:0;mso-height-percent:0;mso-width-relative:page;mso-height-relative:page;v-text-anchor:top" o:gfxdata="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" o:allowincell="f">
                 <v:fill r:id="rId5" o:title="" recolor="t" type="tile"/>
                 <v:path arrowok="t"/>
               </v:rect>
@@ -196,7 +196,7 @@
                 <wp:extent cx="274320" cy="274320"/>
                 <wp:effectExtent l="0" t="0" r="5080" b="5080"/>
                 <wp:wrapNone/>
-                <wp:docPr id="1000772278" name="Rectangle 2"/>
+                <wp:docPr id="1595046344" name="Rectangle 2"/>
                 <wp:cNvGraphicFramePr>
                   <a:graphicFrameLocks xmlns:a="http://schemas.openxmlformats.org/drawingml/2006/main"/>
                 </wp:cNvGraphicFramePr>
@@ -245,7 +245,7 @@
           </mc:Choice>
           <mc:Fallback>
             <w:pict>
-              <v:rect w14:anchorId="52573793" id="Rectangle 2" o:spid="_x0000_s1026" style="position:absolute;margin-left:99.6pt;margin-top:28.75pt;width:21.6pt;height:21.6pt;z-index:251655168;visibility:visible;mso-wrap-style:square;mso-width-percent:0;mso-height-percent:0;mso-wrap-distance-left:9pt;mso-wrap-distance-top:0;mso-wrap-distance-right:9pt;mso-wrap-distance-bottom:0;mso-position-horizontal:absolute;mso-position-horizontal-relative:text;mso-position-vertical:absolute;mso-position-vertical-relative:text;mso-width-percent:0;mso-height-percent:0;mso-width-relative:page;mso-height-relative:page;v-text-anchor:top" o:gfxdata="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" o:allowincell="f">
+              <v:rect w14:anchorId="699A28C2" id="Rectangle 2" o:spid="_x0000_s1026" style="position:absolute;margin-left:99.6pt;margin-top:28.75pt;width:21.6pt;height:21.6pt;z-index:251655168;visibility:visible;mso-wrap-style:square;mso-width-percent:0;mso-height-percent:0;mso-wrap-distance-left:9pt;mso-wrap-distance-top:0;mso-wrap-distance-right:9pt;mso-wrap-distance-bottom:0;mso-position-horizontal:absolute;mso-position-horizontal-relative:text;mso-position-vertical:absolute;mso-position-vertical-relative:text;mso-width-percent:0;mso-height-percent:0;mso-width-relative:page;mso-height-relative:page;v-text-anchor:top" o:gfxdata="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" o:allowincell="f">
                 <v:fill r:id="rId7" o:title="" recolor="t" type="tile"/>
                 <v:path arrowok="t"/>
               </v:rect>
@@ -307,7 +307,7 @@
                 <wp:extent cx="873125" cy="174625"/>
                 <wp:effectExtent l="0" t="0" r="0" b="0"/>
                 <wp:wrapNone/>
-                <wp:docPr id="448595567" name="Text Box 6"/>
+                <wp:docPr id="595370308" name="Text Box 6"/>
                 <wp:cNvGraphicFramePr>
                   <a:graphicFrameLocks xmlns:a="http://schemas.openxmlformats.org/drawingml/2006/main"/>
                 </wp:cNvGraphicFramePr>
@@ -419,7 +419,7 @@
                 <wp:extent cx="1140460" cy="184785"/>
                 <wp:effectExtent l="0" t="0" r="0" b="0"/>
                 <wp:wrapNone/>
-                <wp:docPr id="1490405743" name="Text Box 8"/>
+                <wp:docPr id="2026088095" name="Text Box 8"/>
                 <wp:cNvGraphicFramePr>
                   <a:graphicFrameLocks xmlns:a="http://schemas.openxmlformats.org/drawingml/2006/main"/>
                 </wp:cNvGraphicFramePr>
@@ -527,7 +527,7 @@
                 <wp:extent cx="1140460" cy="173990"/>
                 <wp:effectExtent l="0" t="0" r="0" b="0"/>
                 <wp:wrapNone/>
-                <wp:docPr id="1943873659" name="Text Box 7"/>
+                <wp:docPr id="773912641" name="Text Box 7"/>
                 <wp:cNvGraphicFramePr>
                   <a:graphicFrameLocks xmlns:a="http://schemas.openxmlformats.org/drawingml/2006/main"/>
                 </wp:cNvGraphicFramePr>

</xml_diff>